<commit_message>
Rewrite Core 2 for Copilot Chat and first-time users
Drexel does not have the Microsoft 365 Copilot license, so Core 2 now
uses only Copilot Chat and ChatGPT Edu (paste or upload, then copy the
answer back). Simplified to follow directly from Core 1: guided upload,
three everyday jobs, own task saved as a recipe. Page, HTML slides,
PowerPoint (20 slides, with build script), instructor guide, and demo
file wording updated.

Co-Authored-By: Claude Opus 5.5 <noreply@anthropic.com>
</commit_message>
<xml_diff>
--- a/demo-materials/Workshop2_Demo_EmailThread.docx
+++ b/demo-materials/Workshop2_Demo_EmailThread.docx
@@ -7,7 +7,7 @@
         <w:pStyle w:val="Heading1"/>
       </w:pPr>
       <w:r>
-        <w:t xml:space="preserve">Demo File — Committee Email Thread (Track B: Outlook)</w:t>
+        <w:t xml:space="preserve">Demo File — Committee Email Thread (Track B: Sort an email thread)</w:t>
       </w:r>
     </w:p>
     <w:p>
@@ -22,7 +22,7 @@
           <w:sz w:val="20"/>
           <w:szCs w:val="20"/>
         </w:rPr>
-        <w:t xml:space="preserve">Synthetic teaching material for AI Workshops for DSPH, Workshop 2. All names and courses are fictional. Paste the thread into Copilot Chat or ChatGPT Edu, or use a real (non-sensitive) thread of your own in Outlook.</w:t>
+        <w:t xml:space="preserve">Synthetic teaching material for AI Workshops for DSPH, Workshop 2. All names and courses are fictional. Paste the thread into Copilot Chat or ChatGPT Edu, or paste in a real (non-sensitive) thread of your own from Outlook.</w:t>
       </w:r>
     </w:p>
     <w:p>

</xml_diff>